<commit_message>
Corregir el nombre: es Ester Alvarez, no Esther
</commit_message>
<xml_diff>
--- a/matriz-viral/entregables/1-URGENTE-Publicar-articulo-IA-Revit.docx
+++ b/matriz-viral/entregables/1-URGENTE-Publicar-articulo-IA-Revit.docx
@@ -118,7 +118,7 @@
           <w:sz w:val="19"/>
           <w:szCs w:val="19"/>
         </w:rPr>
-        <w:t xml:space="preserve">Para: Esther</w:t>
+        <w:t xml:space="preserve">Para: Ester Alvarez</w:t>
       </w:r>
       <w:r>
         <w:rPr>
@@ -1106,7 +1106,7 @@
         <w:spacing w:after="140"/>
         <w:ind w:left="280"/>
       </w:pPr>
-      <w:hyperlink w:history="1" r:id="rIdw6eimvi1n_dsn8x2zzonu">
+      <w:hyperlink w:history="1" r:id="rIdmucewip00fzrr1xmov40l">
         <w:r>
           <w:rPr>
             <w:rFonts w:ascii="Consolas" w:cs="Consolas" w:eastAsia="Consolas" w:hAnsi="Consolas"/>
@@ -1702,7 +1702,7 @@
         <w:spacing w:after="140"/>
         <w:ind w:left="280"/>
       </w:pPr>
-      <w:hyperlink w:history="1" r:id="rIdwmu-en7blm3wimsczudja">
+      <w:hyperlink w:history="1" r:id="rIdj4u-63jhlayhnbvdmyeyw">
         <w:r>
           <w:rPr>
             <w:rFonts w:ascii="Consolas" w:cs="Consolas" w:eastAsia="Consolas" w:hAnsi="Consolas"/>
@@ -1880,7 +1880,7 @@
         <w:spacing w:after="140"/>
         <w:ind w:left="280"/>
       </w:pPr>
-      <w:hyperlink w:history="1" r:id="rIdcrpampi0ulj5wc39h35xz">
+      <w:hyperlink w:history="1" r:id="rId2trk7mqrlmmeuvhrwlln4">
         <w:r>
           <w:rPr>
             <w:rFonts w:ascii="Consolas" w:cs="Consolas" w:eastAsia="Consolas" w:hAnsi="Consolas"/>

</xml_diff>